<commit_message>
[DOC] - Docs Uptaded
Updated Docs after MM02
</commit_message>
<xml_diff>
--- a/docs/adrs/word/ADR-0001.docx
+++ b/docs/adrs/word/ADR-0001.docx
@@ -30,7 +30,7 @@
           <w:noProof/>
         </w:rPr>
         <w:drawing>
-          <wp:inline distT="0" distB="0" distL="0" distR="0" wp14:anchorId="0091B9DF" wp14:editId="36F636E8">
+          <wp:inline distT="0" distB="0" distL="0" distR="0" wp14:anchorId="0091B9DF" wp14:editId="50C3EAC7">
             <wp:extent cx="5400040" cy="3980180"/>
             <wp:effectExtent l="0" t="0" r="0" b="0"/>
             <wp:docPr id="1953506445" name="Imagen 1" descr="Identidad corporativa - Universidad de Oviedo - uniovi.es"/>
@@ -184,10 +184,7 @@
         <w:pStyle w:val="ListaCheckList"/>
       </w:pPr>
       <w:r>
-        <w:t>☒</w:t>
-      </w:r>
-      <w:r>
-        <w:t xml:space="preserve"> </w:t>
+        <w:t xml:space="preserve">☐ </w:t>
       </w:r>
       <w:proofErr w:type="spellStart"/>
       <w:r>
@@ -200,7 +197,7 @@
         <w:pStyle w:val="ListaCheckList"/>
       </w:pPr>
       <w:r>
-        <w:t>☐</w:t>
+        <w:t>☒</w:t>
       </w:r>
       <w:r>
         <w:t xml:space="preserve"> </w:t>
@@ -649,7 +646,7 @@
         <w:t xml:space="preserve"> date: </w:t>
       </w:r>
       <w:r>
-        <w:t>---</w:t>
+        <w:t>09/03/2026</w:t>
       </w:r>
     </w:p>
     <w:p>
@@ -670,7 +667,13 @@
       </w:r>
       <w:proofErr w:type="spellEnd"/>
       <w:r>
-        <w:t>: Pendiente de revisión por el tutor</w:t>
+        <w:t xml:space="preserve">: </w:t>
+      </w:r>
+      <w:r>
+        <w:t xml:space="preserve">Cristian </w:t>
+      </w:r>
+      <w:r>
+        <w:t>González García</w:t>
       </w:r>
     </w:p>
     <w:p>
@@ -686,7 +689,13 @@
       </w:r>
       <w:proofErr w:type="spellEnd"/>
       <w:r>
-        <w:t xml:space="preserve"> date: 02/03/2026</w:t>
+        <w:t xml:space="preserve"> date: </w:t>
+      </w:r>
+      <w:r>
+        <w:t>10</w:t>
+      </w:r>
+      <w:r>
+        <w:t>/03/2026</w:t>
       </w:r>
     </w:p>
     <w:p>
@@ -705,7 +714,13 @@
       </w:r>
       <w:proofErr w:type="spellEnd"/>
       <w:r>
-        <w:t>: Creación del ADR</w:t>
+        <w:t xml:space="preserve">: </w:t>
+      </w:r>
+      <w:r>
+        <w:t xml:space="preserve">Aprobación </w:t>
+      </w:r>
+      <w:r>
+        <w:t>del ADR</w:t>
       </w:r>
     </w:p>
     <w:p>

</xml_diff>